<commit_message>
Update report and add Jira screenshots (28 Aug updates)
</commit_message>
<xml_diff>
--- a/★ IFN636 A1 Report.docx
+++ b/★ IFN636 A1 Report.docx
@@ -310,7 +310,7 @@
           <w:sz w:val="22"/>
           <w:szCs w:val="22"/>
         </w:rPr>
-        <w:t>Manages procurement staff accounts (creating and removing accounts)</w:t>
+        <w:t>Reviews and approves newly created suppliers before they become active</w:t>
       </w:r>
     </w:p>
     <w:p>
@@ -332,28 +332,6 @@
           <w:sz w:val="22"/>
           <w:szCs w:val="22"/>
         </w:rPr>
-        <w:t>Reviews and approves newly created suppliers before they become active</w:t>
-      </w:r>
-    </w:p>
-    <w:p>
-      <w:pPr>
-        <w:pStyle w:val="font-claude-response-body"/>
-        <w:numPr>
-          <w:ilvl w:val="0"/>
-          <w:numId w:val="9"/>
-        </w:numPr>
-        <w:rPr>
-          <w:rFonts w:ascii="Calibri" w:hAnsi="Calibri" w:cs="Calibri"/>
-          <w:sz w:val="22"/>
-          <w:szCs w:val="22"/>
-        </w:rPr>
-      </w:pPr>
-      <w:r>
-        <w:rPr>
-          <w:rFonts w:ascii="Calibri" w:hAnsi="Calibri" w:cs="Calibri"/>
-          <w:sz w:val="22"/>
-          <w:szCs w:val="22"/>
-        </w:rPr>
         <w:t>Can view all company-wide supplier data</w:t>
       </w:r>
     </w:p>
@@ -542,7 +520,6 @@
           <w:szCs w:val="22"/>
           <w14:ligatures w14:val="none"/>
         </w:rPr>
-        <w:lastRenderedPageBreak/>
         <w:t>Supplier qualification status records and expiry tracking (status submitted by Procurement Officers based on the Document Control Department's offline review outcome, and confirmed by Admin)</w:t>
       </w:r>
     </w:p>
@@ -569,6 +546,7 @@
           <w:szCs w:val="22"/>
           <w14:ligatures w14:val="none"/>
         </w:rPr>
+        <w:lastRenderedPageBreak/>
         <w:t>New supplier records subject to Admin review and approval before becoming active</w:t>
       </w:r>
     </w:p>
@@ -779,46 +757,52 @@
     </w:p>
     <w:p>
       <w:pPr>
+        <w:numPr>
+          <w:ilvl w:val="0"/>
+          <w:numId w:val="12"/>
+        </w:numPr>
         <w:spacing w:before="100" w:beforeAutospacing="1" w:after="100" w:afterAutospacing="1" w:line="240" w:lineRule="auto"/>
         <w:rPr>
           <w:rFonts w:ascii="Calibri" w:eastAsia="Times New Roman" w:hAnsi="Calibri" w:cs="Calibri"/>
-          <w:kern w:val="0"/>
-          <w:sz w:val="22"/>
-          <w:szCs w:val="22"/>
-          <w14:ligatures w14:val="none"/>
-        </w:rPr>
-      </w:pPr>
-      <w:r>
-        <w:rPr>
-          <w:rFonts w:ascii="Calibri" w:eastAsia="Times New Roman" w:hAnsi="Calibri" w:cs="Calibri"/>
-          <w:kern w:val="0"/>
-          <w:sz w:val="22"/>
-          <w:szCs w:val="22"/>
-          <w14:ligatures w14:val="none"/>
-        </w:rPr>
-        <w:t xml:space="preserve">The items above fall within the scope of a procurement transaction execution system or the responsibilities of the Document Control </w:t>
-      </w:r>
-      <w:proofErr w:type="gramStart"/>
-      <w:r>
-        <w:rPr>
-          <w:rFonts w:ascii="Calibri" w:eastAsia="Times New Roman" w:hAnsi="Calibri" w:cs="Calibri"/>
-          <w:kern w:val="0"/>
-          <w:sz w:val="22"/>
-          <w:szCs w:val="22"/>
-          <w14:ligatures w14:val="none"/>
-        </w:rPr>
-        <w:t>Department, and</w:t>
-      </w:r>
-      <w:proofErr w:type="gramEnd"/>
-      <w:r>
-        <w:rPr>
-          <w:rFonts w:ascii="Calibri" w:eastAsia="Times New Roman" w:hAnsi="Calibri" w:cs="Calibri"/>
-          <w:kern w:val="0"/>
-          <w:sz w:val="22"/>
-          <w:szCs w:val="22"/>
-          <w14:ligatures w14:val="none"/>
-        </w:rPr>
-        <w:t xml:space="preserve"> are not design goals of this system (a contact and qualification management system).</w:t>
+          <w:color w:val="EE0000"/>
+          <w:kern w:val="0"/>
+          <w:sz w:val="22"/>
+          <w:szCs w:val="22"/>
+          <w14:ligatures w14:val="none"/>
+        </w:rPr>
+      </w:pPr>
+      <w:r>
+        <w:rPr>
+          <w:rFonts w:ascii="Calibri" w:eastAsia="Times New Roman" w:hAnsi="Calibri" w:cs="Calibri"/>
+          <w:color w:val="EE0000"/>
+          <w:kern w:val="0"/>
+          <w:sz w:val="22"/>
+          <w:szCs w:val="22"/>
+          <w14:ligatures w14:val="none"/>
+        </w:rPr>
+        <w:t>Staff account creation and deletion — handled externally by the IT department outside the system; manager sign-off for account provisioning also occurs off-system.</w:t>
+      </w:r>
+    </w:p>
+    <w:p>
+      <w:pPr>
+        <w:spacing w:before="100" w:beforeAutospacing="1" w:after="100" w:afterAutospacing="1" w:line="240" w:lineRule="auto"/>
+        <w:rPr>
+          <w:rFonts w:ascii="Calibri" w:eastAsia="Times New Roman" w:hAnsi="Calibri" w:cs="Calibri"/>
+          <w:kern w:val="0"/>
+          <w:sz w:val="22"/>
+          <w:szCs w:val="22"/>
+          <w14:ligatures w14:val="none"/>
+        </w:rPr>
+      </w:pPr>
+      <w:r>
+        <w:rPr>
+          <w:rFonts w:ascii="Calibri" w:eastAsia="Times New Roman" w:hAnsi="Calibri" w:cs="Calibri"/>
+          <w:kern w:val="0"/>
+          <w:sz w:val="22"/>
+          <w:szCs w:val="22"/>
+          <w14:ligatures w14:val="none"/>
+        </w:rPr>
+        <w:t>The items above fall within the scope of a procurement transaction execution system or the responsibilities of the Document Control Department, and are not design goals of this system (a contact and qualification management system).</w:t>
       </w:r>
     </w:p>
     <w:p>
@@ -973,24 +957,86 @@
     </w:p>
     <w:p>
       <w:pPr>
-        <w:spacing w:before="100" w:beforeAutospacing="1" w:after="100" w:afterAutospacing="1" w:line="240" w:lineRule="auto"/>
-        <w:rPr>
-          <w:rFonts w:ascii="Calibri" w:eastAsia="Times New Roman" w:hAnsi="Calibri" w:cs="Calibri"/>
-          <w:kern w:val="0"/>
-          <w:sz w:val="22"/>
-          <w:szCs w:val="22"/>
-          <w14:ligatures w14:val="none"/>
-        </w:rPr>
-      </w:pPr>
-      <w:r>
-        <w:rPr>
-          <w:rFonts w:ascii="Calibri" w:eastAsia="Times New Roman" w:hAnsi="Calibri" w:cs="Calibri"/>
-          <w:kern w:val="0"/>
-          <w:sz w:val="22"/>
-          <w:szCs w:val="22"/>
-          <w14:ligatures w14:val="none"/>
-        </w:rPr>
-        <w:t>[To be completed]</w:t>
+        <w:pStyle w:val="font-claude-response-body"/>
+        <w:rPr>
+          <w:rFonts w:ascii="Calibri" w:hAnsi="Calibri" w:cs="Calibri"/>
+          <w:sz w:val="22"/>
+          <w:szCs w:val="22"/>
+        </w:rPr>
+      </w:pPr>
+      <w:r>
+        <w:rPr>
+          <w:rFonts w:ascii="Calibri" w:hAnsi="Calibri" w:cs="Calibri"/>
+          <w:b/>
+          <w:bCs/>
+          <w:sz w:val="22"/>
+          <w:szCs w:val="22"/>
+        </w:rPr>
+        <w:t>Account provisioning is IT-managed, not system-managed.</w:t>
+      </w:r>
+      <w:r>
+        <w:rPr>
+          <w:rFonts w:ascii="Calibri" w:hAnsi="Calibri" w:cs="Calibri"/>
+          <w:sz w:val="22"/>
+          <w:szCs w:val="22"/>
+        </w:rPr>
+        <w:t xml:space="preserve"> Staff account creation and manager sign-off are assumed to occur through the organisation's existing IT provisioning process outside this system. This system assumes accounts already exist and focuses only on role-based access control once a user is authenticated.</w:t>
+      </w:r>
+    </w:p>
+    <w:p>
+      <w:pPr>
+        <w:pStyle w:val="font-claude-response-body"/>
+        <w:rPr>
+          <w:rFonts w:ascii="Calibri" w:hAnsi="Calibri" w:cs="Calibri"/>
+          <w:sz w:val="22"/>
+          <w:szCs w:val="22"/>
+        </w:rPr>
+      </w:pPr>
+      <w:r>
+        <w:rPr>
+          <w:rFonts w:ascii="Calibri" w:hAnsi="Calibri" w:cs="Calibri"/>
+          <w:b/>
+          <w:bCs/>
+          <w:sz w:val="22"/>
+          <w:szCs w:val="22"/>
+        </w:rPr>
+        <w:t>Supplier removal is reversible by design.</w:t>
+      </w:r>
+      <w:r>
+        <w:rPr>
+          <w:rFonts w:ascii="Calibri" w:hAnsi="Calibri" w:cs="Calibri"/>
+          <w:sz w:val="22"/>
+          <w:szCs w:val="22"/>
+        </w:rPr>
+        <w:t xml:space="preserve"> It is assumed that removing a supplier from active use is a routine, reversible operational action (deactivation) rather than a permanent deletion. Permanent deletion is out of scope, as it is assumed to carry higher risk and would require separate governance not covered by this system.</w:t>
+      </w:r>
+    </w:p>
+    <w:p>
+      <w:pPr>
+        <w:pStyle w:val="font-claude-response-body"/>
+        <w:rPr>
+          <w:rFonts w:ascii="Calibri" w:hAnsi="Calibri" w:cs="Calibri"/>
+          <w:sz w:val="22"/>
+          <w:szCs w:val="22"/>
+        </w:rPr>
+      </w:pPr>
+      <w:r>
+        <w:rPr>
+          <w:rFonts w:ascii="Calibri" w:hAnsi="Calibri" w:cs="Calibri"/>
+          <w:b/>
+          <w:bCs/>
+          <w:sz w:val="22"/>
+          <w:szCs w:val="22"/>
+        </w:rPr>
+        <w:t>Qualification correction is handled via resubmission.</w:t>
+      </w:r>
+      <w:r>
+        <w:rPr>
+          <w:rFonts w:ascii="Calibri" w:hAnsi="Calibri" w:cs="Calibri"/>
+          <w:sz w:val="22"/>
+          <w:szCs w:val="22"/>
+        </w:rPr>
+        <w:t xml:space="preserve"> It is assumed that any need to amend a qualification submission prior to confirmation can be addressed by resubmitting the qualification, rather than requiring a dedicated correction/edit feature. This avoids redundant functionality while still allowing officers to fix mistakes before Admin review.</w:t>
       </w:r>
     </w:p>
     <w:p>
@@ -3107,7 +3153,6 @@
   <w:style w:type="character" w:default="1" w:styleId="DefaultParagraphFont">
     <w:name w:val="Default Paragraph Font"/>
     <w:uiPriority w:val="1"/>
-    <w:semiHidden/>
     <w:unhideWhenUsed/>
   </w:style>
   <w:style w:type="table" w:default="1" w:styleId="TableNormal">

</xml_diff>

<commit_message>
Update report: fix In Scope wording and formatting inconsistencies
</commit_message>
<xml_diff>
--- a/★ IFN636 A1 Report.docx
+++ b/★ IFN636 A1 Report.docx
@@ -316,28 +316,6 @@
     <w:p>
       <w:pPr>
         <w:pStyle w:val="font-claude-response-body"/>
-        <w:numPr>
-          <w:ilvl w:val="0"/>
-          <w:numId w:val="9"/>
-        </w:numPr>
-        <w:rPr>
-          <w:rFonts w:ascii="Calibri" w:hAnsi="Calibri" w:cs="Calibri"/>
-          <w:sz w:val="22"/>
-          <w:szCs w:val="22"/>
-        </w:rPr>
-      </w:pPr>
-      <w:r>
-        <w:rPr>
-          <w:rFonts w:ascii="Calibri" w:hAnsi="Calibri" w:cs="Calibri"/>
-          <w:sz w:val="22"/>
-          <w:szCs w:val="22"/>
-        </w:rPr>
-        <w:t>Can view all company-wide supplier data</w:t>
-      </w:r>
-    </w:p>
-    <w:p>
-      <w:pPr>
-        <w:pStyle w:val="font-claude-response-body"/>
         <w:rPr>
           <w:rFonts w:ascii="Calibri" w:hAnsi="Calibri" w:cs="Calibri"/>
           <w:sz w:val="22"/>
@@ -468,7 +446,27 @@
           <w:szCs w:val="22"/>
           <w14:ligatures w14:val="none"/>
         </w:rPr>
-        <w:t>Supplier profile management (create, view, edit, delete)</w:t>
+        <w:t xml:space="preserve">Supplier profile management (create, view, edit, </w:t>
+      </w:r>
+      <w:r>
+        <w:rPr>
+          <w:rFonts w:ascii="Calibri" w:eastAsia="Times New Roman" w:hAnsi="Calibri" w:cs="Calibri"/>
+          <w:kern w:val="0"/>
+          <w:sz w:val="22"/>
+          <w:szCs w:val="22"/>
+          <w14:ligatures w14:val="none"/>
+        </w:rPr>
+        <w:t>deactivate/reactivate</w:t>
+      </w:r>
+      <w:r>
+        <w:rPr>
+          <w:rFonts w:ascii="Calibri" w:eastAsia="Times New Roman" w:hAnsi="Calibri" w:cs="Calibri"/>
+          <w:kern w:val="0"/>
+          <w:sz w:val="22"/>
+          <w:szCs w:val="22"/>
+          <w14:ligatures w14:val="none"/>
+        </w:rPr>
+        <w:t>)</w:t>
       </w:r>
     </w:p>
     <w:p>
@@ -546,7 +544,6 @@
           <w:szCs w:val="22"/>
           <w14:ligatures w14:val="none"/>
         </w:rPr>
-        <w:lastRenderedPageBreak/>
         <w:t>New supplier records subject to Admin review and approval before becoming active</w:t>
       </w:r>
     </w:p>
@@ -573,6 +570,7 @@
           <w:szCs w:val="22"/>
           <w14:ligatures w14:val="none"/>
         </w:rPr>
+        <w:lastRenderedPageBreak/>
         <w:t>Role-based access control (data access and permissions differ between Admin and Procurement Officer)</w:t>
       </w:r>
     </w:p>
@@ -752,7 +750,7 @@
           <w:szCs w:val="22"/>
           <w14:ligatures w14:val="none"/>
         </w:rPr>
-        <w:t>The actual review of qualification documents and storage of document files (handled offline by the Document Control Department; the system only records the resulting review status)</w:t>
+        <w:t>The actual review of qualification documents, and the storage of files following the Document Control Department's review — both handled offline by the Document Control Department; the system only records the resulting review status.</w:t>
       </w:r>
     </w:p>
     <w:p>
@@ -802,7 +800,29 @@
           <w:szCs w:val="22"/>
           <w14:ligatures w14:val="none"/>
         </w:rPr>
-        <w:t>The items above fall within the scope of a procurement transaction execution system or the responsibilities of the Document Control Department, and are not design goals of this system (a contact and qualification management system).</w:t>
+        <w:t xml:space="preserve">The items above fall within the scope of a procurement transaction execution system or the responsibilities of the Document Control </w:t>
+      </w:r>
+      <w:proofErr w:type="gramStart"/>
+      <w:r>
+        <w:rPr>
+          <w:rFonts w:ascii="Calibri" w:eastAsia="Times New Roman" w:hAnsi="Calibri" w:cs="Calibri"/>
+          <w:kern w:val="0"/>
+          <w:sz w:val="22"/>
+          <w:szCs w:val="22"/>
+          <w14:ligatures w14:val="none"/>
+        </w:rPr>
+        <w:t>Department, and</w:t>
+      </w:r>
+      <w:proofErr w:type="gramEnd"/>
+      <w:r>
+        <w:rPr>
+          <w:rFonts w:ascii="Calibri" w:eastAsia="Times New Roman" w:hAnsi="Calibri" w:cs="Calibri"/>
+          <w:kern w:val="0"/>
+          <w:sz w:val="22"/>
+          <w:szCs w:val="22"/>
+          <w14:ligatures w14:val="none"/>
+        </w:rPr>
+        <w:t xml:space="preserve"> are not design goals of this system (a contact and qualification management system).</w:t>
       </w:r>
     </w:p>
     <w:p>
@@ -877,7 +897,7 @@
           <w:szCs w:val="22"/>
           <w14:ligatures w14:val="none"/>
         </w:rPr>
-        <w:t>Each contact person is clearly labelled with their area of responsibility, allowing procurement staff to identify the right contact within 2 steps</w:t>
+        <w:t>Each contact person is clearly labelled with their area of responsibility, allowing procurement staff to identify the right contact</w:t>
       </w:r>
     </w:p>
     <w:p>
@@ -889,15 +909,17 @@
         <w:spacing w:before="100" w:beforeAutospacing="1" w:after="100" w:afterAutospacing="1" w:line="240" w:lineRule="auto"/>
         <w:rPr>
           <w:rFonts w:ascii="Calibri" w:eastAsia="Times New Roman" w:hAnsi="Calibri" w:cs="Calibri"/>
-          <w:kern w:val="0"/>
-          <w:sz w:val="22"/>
-          <w:szCs w:val="22"/>
-          <w14:ligatures w14:val="none"/>
-        </w:rPr>
-      </w:pPr>
-      <w:r>
-        <w:rPr>
-          <w:rFonts w:ascii="Calibri" w:eastAsia="Times New Roman" w:hAnsi="Calibri" w:cs="Calibri"/>
+          <w:color w:val="ADADAD" w:themeColor="background2" w:themeShade="BF"/>
+          <w:kern w:val="0"/>
+          <w:sz w:val="22"/>
+          <w:szCs w:val="22"/>
+          <w14:ligatures w14:val="none"/>
+        </w:rPr>
+      </w:pPr>
+      <w:r>
+        <w:rPr>
+          <w:rFonts w:ascii="Calibri" w:eastAsia="Times New Roman" w:hAnsi="Calibri" w:cs="Calibri"/>
+          <w:color w:val="ADADAD" w:themeColor="background2" w:themeShade="BF"/>
           <w:kern w:val="0"/>
           <w:sz w:val="22"/>
           <w:szCs w:val="22"/>
@@ -915,15 +937,17 @@
         <w:spacing w:before="100" w:beforeAutospacing="1" w:after="100" w:afterAutospacing="1" w:line="240" w:lineRule="auto"/>
         <w:rPr>
           <w:rFonts w:ascii="Calibri" w:eastAsia="Times New Roman" w:hAnsi="Calibri" w:cs="Calibri"/>
-          <w:kern w:val="0"/>
-          <w:sz w:val="22"/>
-          <w:szCs w:val="22"/>
-          <w14:ligatures w14:val="none"/>
-        </w:rPr>
-      </w:pPr>
-      <w:r>
-        <w:rPr>
-          <w:rFonts w:ascii="Calibri" w:eastAsia="Times New Roman" w:hAnsi="Calibri" w:cs="Calibri"/>
+          <w:color w:val="ADADAD" w:themeColor="background2" w:themeShade="BF"/>
+          <w:kern w:val="0"/>
+          <w:sz w:val="22"/>
+          <w:szCs w:val="22"/>
+          <w14:ligatures w14:val="none"/>
+        </w:rPr>
+      </w:pPr>
+      <w:r>
+        <w:rPr>
+          <w:rFonts w:ascii="Calibri" w:eastAsia="Times New Roman" w:hAnsi="Calibri" w:cs="Calibri"/>
+          <w:color w:val="ADADAD" w:themeColor="background2" w:themeShade="BF"/>
           <w:kern w:val="0"/>
           <w:sz w:val="22"/>
           <w:szCs w:val="22"/>
@@ -987,7 +1011,7 @@
       <w:pPr>
         <w:pStyle w:val="font-claude-response-body"/>
         <w:rPr>
-          <w:rFonts w:ascii="Calibri" w:hAnsi="Calibri" w:cs="Calibri"/>
+          <w:rFonts w:ascii="Calibri" w:hAnsi="Calibri" w:cs="Calibri" w:hint="eastAsia"/>
           <w:sz w:val="22"/>
           <w:szCs w:val="22"/>
         </w:rPr>
@@ -1008,46 +1032,8 @@
           <w:sz w:val="22"/>
           <w:szCs w:val="22"/>
         </w:rPr>
-        <w:t xml:space="preserve"> It is assumed that removing a supplier from active use is a routine, reversible operational action (deactivation) rather than a permanent deletion. Permanent deletion is out of scope, as it is assumed to carry higher risk and would require separate governance not covered by this system.</w:t>
-      </w:r>
-    </w:p>
-    <w:p>
-      <w:pPr>
-        <w:pStyle w:val="font-claude-response-body"/>
-        <w:rPr>
-          <w:rFonts w:ascii="Calibri" w:hAnsi="Calibri" w:cs="Calibri"/>
-          <w:sz w:val="22"/>
-          <w:szCs w:val="22"/>
-        </w:rPr>
-      </w:pPr>
-      <w:r>
-        <w:rPr>
-          <w:rFonts w:ascii="Calibri" w:hAnsi="Calibri" w:cs="Calibri"/>
-          <w:b/>
-          <w:bCs/>
-          <w:sz w:val="22"/>
-          <w:szCs w:val="22"/>
-        </w:rPr>
-        <w:t>Qualification correction is handled via resubmission.</w:t>
-      </w:r>
-      <w:r>
-        <w:rPr>
-          <w:rFonts w:ascii="Calibri" w:hAnsi="Calibri" w:cs="Calibri"/>
-          <w:sz w:val="22"/>
-          <w:szCs w:val="22"/>
-        </w:rPr>
-        <w:t xml:space="preserve"> It is assumed that any need to amend a qualification submission prior to confirmation can be addressed by resubmitting the qualification, rather than requiring a dedicated correction/edit feature. This avoids redundant functionality while still allowing officers to fix mistakes before Admin review.</w:t>
-      </w:r>
-    </w:p>
-    <w:p>
-      <w:pPr>
-        <w:pStyle w:val="font-claude-response-body"/>
-        <w:rPr>
-          <w:rFonts w:ascii="Calibri" w:hAnsi="Calibri" w:cs="Calibri"/>
-          <w:sz w:val="22"/>
-          <w:szCs w:val="22"/>
-        </w:rPr>
-      </w:pPr>
+        <w:t xml:space="preserve"> It is assumed that removing a supplier from active use is a routine, reversible operational action (deactivation) rather than a permanent deletion. Permanent deletion is out of scope.</w:t>
+      </w:r>
     </w:p>
     <w:p>
       <w:pPr>

</xml_diff>